<commit_message>
Supports dual-column debtor signatures
Implements a two-column layout for displaying debtor signatures in generated documents. This change enhances the document's visual appeal and organization, particularly when dealing with multiple debtors.

The previous single-column approach is replaced with a table structure that accommodates two signatures per row. The code now processes the list of debtors and arranges them into pairs for display in the table.
</commit_message>
<xml_diff>
--- a/apps/legal-docs-blueprints/templates/carta_carro_nuevo/carta_carro_nuevo-mujer-plural.docx
+++ b/apps/legal-docs-blueprints/templates/carta_carro_nuevo/carta_carro_nuevo-mujer-plural.docx
@@ -716,6 +716,24 @@
       <w:r>
         <w:rPr>
           <w:rFonts w:eastAsia="Arial" w:cs="Arial" w:ascii="Arial" w:hAnsi="Arial"/>
+          <w:sz w:val="20"/>
+          <w:szCs w:val="20"/>
+        </w:rPr>
+      </w:r>
+    </w:p>
+    <w:p>
+      <w:pPr>
+        <w:pStyle w:val="normal1"/>
+        <w:jc w:val="both"/>
+        <w:rPr>
+          <w:rFonts w:ascii="Arial" w:hAnsi="Arial" w:eastAsia="Arial" w:cs="Arial"/>
+          <w:sz w:val="20"/>
+          <w:szCs w:val="20"/>
+        </w:rPr>
+      </w:pPr>
+      <w:r>
+        <w:rPr>
+          <w:rFonts w:eastAsia="Arial" w:cs="Arial" w:ascii="Arial" w:hAnsi="Arial"/>
           <w:color w:val="000000"/>
           <w:sz w:val="20"/>
           <w:szCs w:val="20"/>
@@ -729,79 +747,193 @@
         <w:rPr/>
       </w:pPr>
       <w:r>
-        <w:rPr>
-          <w:rFonts w:cs="Arial" w:ascii="Arial" w:hAnsi="Arial"/>
-          <w:sz w:val="20"/>
-          <w:szCs w:val="20"/>
-        </w:rPr>
-        <w:t>{#firmantes}</w:t>
+        <w:rPr/>
+        <w:t>{#firmantesFilas}</w:t>
       </w:r>
     </w:p>
-    <w:p>
-      <w:pPr>
-        <w:pStyle w:val="Normal"/>
-        <w:jc w:val="center"/>
-        <w:rPr/>
-      </w:pPr>
-      <w:r>
-        <w:rPr/>
-      </w:r>
-    </w:p>
-    <w:p>
-      <w:pPr>
-        <w:pStyle w:val="Normal"/>
-        <w:jc w:val="center"/>
-        <w:rPr/>
-      </w:pPr>
-      <w:r>
-        <w:rPr>
-          <w:rFonts w:cs="Arial" w:ascii="Arial" w:hAnsi="Arial"/>
-          <w:sz w:val="20"/>
-          <w:szCs w:val="20"/>
-        </w:rPr>
-        <w:t>F)________________________</w:t>
-      </w:r>
-    </w:p>
-    <w:p>
-      <w:pPr>
-        <w:pStyle w:val="Normal"/>
-        <w:jc w:val="center"/>
-        <w:rPr/>
-      </w:pPr>
-      <w:r>
-        <w:rPr>
-          <w:rFonts w:cs="Arial" w:ascii="Arial" w:hAnsi="Arial"/>
-          <w:sz w:val="20"/>
-          <w:szCs w:val="20"/>
-        </w:rPr>
-        <w:t>{nombreCompleto}</w:t>
-      </w:r>
-    </w:p>
-    <w:p>
-      <w:pPr>
-        <w:pStyle w:val="Normal"/>
-        <w:jc w:val="center"/>
-        <w:rPr/>
-      </w:pPr>
-      <w:r>
-        <w:rPr>
-          <w:rFonts w:cs="Arial" w:ascii="Arial" w:hAnsi="Arial"/>
-          <w:sz w:val="20"/>
-          <w:szCs w:val="20"/>
-        </w:rPr>
-        <w:t>{dpi}</w:t>
-      </w:r>
-    </w:p>
-    <w:p>
-      <w:pPr>
-        <w:pStyle w:val="Normal"/>
-        <w:jc w:val="center"/>
-        <w:rPr/>
-      </w:pPr>
-      <w:r>
-        <w:rPr/>
-      </w:r>
-    </w:p>
+    <w:tbl>
+      <w:tblPr>
+        <w:tblW w:w="5000" w:type="pct"/>
+        <w:jc w:val="left"/>
+        <w:tblInd w:w="0" w:type="dxa"/>
+        <w:tblLayout w:type="fixed"/>
+        <w:tblCellMar>
+          <w:top w:w="0" w:type="dxa"/>
+          <w:left w:w="108" w:type="dxa"/>
+          <w:bottom w:w="0" w:type="dxa"/>
+          <w:right w:w="108" w:type="dxa"/>
+        </w:tblCellMar>
+      </w:tblPr>
+      <w:tblGrid>
+        <w:gridCol w:w="4679"/>
+        <w:gridCol w:w="4680"/>
+      </w:tblGrid>
+      <w:tr>
+        <w:trPr/>
+        <w:tc>
+          <w:tcPr>
+            <w:tcW w:w="4679" w:type="dxa"/>
+            <w:tcBorders/>
+          </w:tcPr>
+          <w:p>
+            <w:pPr>
+              <w:pStyle w:val="Normal"/>
+              <w:jc w:val="center"/>
+              <w:rPr/>
+            </w:pPr>
+            <w:r>
+              <w:rPr/>
+            </w:r>
+          </w:p>
+          <w:p>
+            <w:pPr>
+              <w:pStyle w:val="Normal"/>
+              <w:jc w:val="center"/>
+              <w:rPr/>
+            </w:pPr>
+            <w:r>
+              <w:rPr>
+                <w:rFonts w:ascii="Arial" w:hAnsi="Arial"/>
+                <w:sz w:val="20"/>
+              </w:rPr>
+              <w:t>F)________________________</w:t>
+            </w:r>
+          </w:p>
+          <w:p>
+            <w:pPr>
+              <w:pStyle w:val="Normal"/>
+              <w:jc w:val="center"/>
+              <w:rPr/>
+            </w:pPr>
+            <w:r>
+              <w:rPr>
+                <w:rFonts w:ascii="Arial" w:hAnsi="Arial"/>
+                <w:sz w:val="20"/>
+              </w:rPr>
+              <w:t>{col1.nombreCompleto}</w:t>
+            </w:r>
+          </w:p>
+          <w:p>
+            <w:pPr>
+              <w:pStyle w:val="Normal"/>
+              <w:jc w:val="center"/>
+              <w:rPr/>
+            </w:pPr>
+            <w:r>
+              <w:rPr>
+                <w:rFonts w:ascii="Arial" w:hAnsi="Arial"/>
+                <w:sz w:val="20"/>
+              </w:rPr>
+              <w:t>{col1.dpi}</w:t>
+            </w:r>
+          </w:p>
+          <w:p>
+            <w:pPr>
+              <w:pStyle w:val="Normal"/>
+              <w:spacing w:before="0" w:after="160"/>
+              <w:jc w:val="center"/>
+              <w:rPr/>
+            </w:pPr>
+            <w:r>
+              <w:rPr/>
+            </w:r>
+          </w:p>
+        </w:tc>
+        <w:tc>
+          <w:tcPr>
+            <w:tcW w:w="4680" w:type="dxa"/>
+            <w:tcBorders/>
+          </w:tcPr>
+          <w:p>
+            <w:pPr>
+              <w:pStyle w:val="Normal"/>
+              <w:rPr/>
+            </w:pPr>
+            <w:r>
+              <w:rPr/>
+              <w:t>{#col2}</w:t>
+            </w:r>
+          </w:p>
+          <w:p>
+            <w:pPr>
+              <w:pStyle w:val="Normal"/>
+              <w:jc w:val="center"/>
+              <w:rPr/>
+            </w:pPr>
+            <w:r>
+              <w:rPr/>
+            </w:r>
+          </w:p>
+          <w:p>
+            <w:pPr>
+              <w:pStyle w:val="Normal"/>
+              <w:jc w:val="center"/>
+              <w:rPr/>
+            </w:pPr>
+            <w:r>
+              <w:rPr>
+                <w:rFonts w:ascii="Arial" w:hAnsi="Arial"/>
+                <w:sz w:val="20"/>
+              </w:rPr>
+              <w:t>F)________________________</w:t>
+            </w:r>
+          </w:p>
+          <w:p>
+            <w:pPr>
+              <w:pStyle w:val="Normal"/>
+              <w:jc w:val="center"/>
+              <w:rPr/>
+            </w:pPr>
+            <w:r>
+              <w:rPr>
+                <w:rFonts w:ascii="Arial" w:hAnsi="Arial"/>
+                <w:sz w:val="20"/>
+              </w:rPr>
+              <w:t>{nombreCompleto}</w:t>
+            </w:r>
+          </w:p>
+          <w:p>
+            <w:pPr>
+              <w:pStyle w:val="Normal"/>
+              <w:jc w:val="center"/>
+              <w:rPr/>
+            </w:pPr>
+            <w:r>
+              <w:rPr>
+                <w:rFonts w:ascii="Arial" w:hAnsi="Arial"/>
+                <w:sz w:val="20"/>
+              </w:rPr>
+              <w:t>{dpi}</w:t>
+            </w:r>
+          </w:p>
+          <w:p>
+            <w:pPr>
+              <w:pStyle w:val="Normal"/>
+              <w:jc w:val="center"/>
+              <w:rPr/>
+            </w:pPr>
+            <w:r>
+              <w:rPr/>
+            </w:r>
+          </w:p>
+          <w:p>
+            <w:pPr>
+              <w:pStyle w:val="Normal"/>
+              <w:widowControl/>
+              <w:suppressAutoHyphens w:val="true"/>
+              <w:bidi w:val="0"/>
+              <w:spacing w:lineRule="auto" w:line="276" w:before="0" w:after="160"/>
+              <w:jc w:val="left"/>
+              <w:rPr/>
+            </w:pPr>
+            <w:r>
+              <w:rPr/>
+              <w:t>{/col2}</w:t>
+            </w:r>
+          </w:p>
+        </w:tc>
+      </w:tr>
+    </w:tbl>
     <w:p>
       <w:pPr>
         <w:pStyle w:val="Normal"/>
@@ -813,12 +945,8 @@
         <w:rPr/>
       </w:pPr>
       <w:r>
-        <w:rPr>
-          <w:rFonts w:cs="Arial" w:ascii="Arial" w:hAnsi="Arial"/>
-          <w:sz w:val="20"/>
-          <w:szCs w:val="20"/>
-        </w:rPr>
-        <w:t>{/firmantes}</w:t>
+        <w:rPr/>
+        <w:t>{/firmantesFilas}</w:t>
       </w:r>
     </w:p>
     <w:sectPr>

</xml_diff>

<commit_message>
Transforms templates for multiple debtors
Adds a script to convert singular DOCX templates to plural, supporting multiple debtors.

The script automates the process of:
- Replacing singular pronouns with plural forms.
- Incorporating docxtemplater syntax for debtor loops.
- Implementing signature tables for multiple signatories.

The changes include added pluralized versions of existing document templates.
</commit_message>
<xml_diff>
--- a/apps/legal-docs-blueprints/templates/carta_carro_nuevo/carta_carro_nuevo-mujer-plural.docx
+++ b/apps/legal-docs-blueprints/templates/carta_carro_nuevo/carta_carro_nuevo-mujer-plural.docx
@@ -292,7 +292,7 @@
           <w:szCs w:val="20"/>
           <w:highlight w:val="white"/>
         </w:rPr>
-        <w:t>extendido por el Registro Nacional de las Personas –RENAP-, República de Guatemala, Centroamérica{#deudoresAdicionales} y {nombreCompleto}, identificada con Documento Personal de Identificación, Código Único de Identificación {dpiTexto}, extendido por el Registro Nacional de las Personas –RENAP-, República de Guatemala, Centroamérica{/deudoresAdicionales},</w:t>
+        <w:t>extendido por el Registro Nacional de las Personas –RENAP-, República de Guatemala, Centroamérica{#deudoresAdicionales} y {nombreCompleto}, de {edadTexto} años de edad, {estadoCivil}, {profesion}, {nacionalidad}, identificada con Documento Personal de Identificación, Código Único de Identificación {dpiTexto}, extendido por el Registro Nacional de las Personas –RENAP-, República de Guatemala, Centroamérica{/deudoresAdicionales},</w:t>
       </w:r>
       <w:r>
         <w:rPr>
@@ -698,26 +698,10 @@
       <w:r>
         <w:rPr>
           <w:rFonts w:eastAsia="Arial" w:cs="Arial" w:ascii="Arial" w:hAnsi="Arial"/>
-          <w:sz w:val="20"/>
-          <w:szCs w:val="20"/>
-        </w:rPr>
-      </w:r>
-    </w:p>
-    <w:p>
-      <w:pPr>
-        <w:pStyle w:val="normal1"/>
-        <w:jc w:val="both"/>
-        <w:rPr>
-          <w:rFonts w:ascii="Arial" w:hAnsi="Arial" w:eastAsia="Arial" w:cs="Arial"/>
-          <w:sz w:val="20"/>
-          <w:szCs w:val="20"/>
-        </w:rPr>
-      </w:pPr>
-      <w:r>
-        <w:rPr>
-          <w:rFonts w:eastAsia="Arial" w:cs="Arial" w:ascii="Arial" w:hAnsi="Arial"/>
-          <w:sz w:val="20"/>
-          <w:szCs w:val="20"/>
+          <w:color w:val="000000"/>
+          <w:sz w:val="20"/>
+          <w:szCs w:val="20"/>
+          <w:lang w:val="en-US"/>
         </w:rPr>
       </w:r>
     </w:p>
@@ -810,7 +794,7 @@
                 <w:rFonts w:ascii="Arial" w:hAnsi="Arial"/>
                 <w:sz w:val="20"/>
               </w:rPr>
-              <w:t>{col1.nombreCompleto}</w:t>
+              <w:t>{col1nombreCompleto}</w:t>
             </w:r>
           </w:p>
           <w:p>
@@ -824,7 +808,7 @@
                 <w:rFonts w:ascii="Arial" w:hAnsi="Arial"/>
                 <w:sz w:val="20"/>
               </w:rPr>
-              <w:t>{col1.dpi}</w:t>
+              <w:t>{col1dpi}</w:t>
             </w:r>
           </w:p>
           <w:p>
@@ -851,7 +835,7 @@
             </w:pPr>
             <w:r>
               <w:rPr/>
-              <w:t>{#col2}</w:t>
+              <w:t>{#tieneCol2}</w:t>
             </w:r>
           </w:p>
           <w:p>
@@ -889,7 +873,7 @@
                 <w:rFonts w:ascii="Arial" w:hAnsi="Arial"/>
                 <w:sz w:val="20"/>
               </w:rPr>
-              <w:t>{nombreCompleto}</w:t>
+              <w:t>{col2nombreCompleto}</w:t>
             </w:r>
           </w:p>
           <w:p>
@@ -903,7 +887,7 @@
                 <w:rFonts w:ascii="Arial" w:hAnsi="Arial"/>
                 <w:sz w:val="20"/>
               </w:rPr>
-              <w:t>{dpi}</w:t>
+              <w:t>{col2dpi}</w:t>
             </w:r>
           </w:p>
           <w:p>
@@ -928,7 +912,7 @@
             </w:pPr>
             <w:r>
               <w:rPr/>
-              <w:t>{/col2}</w:t>
+              <w:t>{/tieneCol2}</w:t>
             </w:r>
           </w:p>
         </w:tc>

</xml_diff>